<commit_message>
Full academic secitons & student form only
</commit_message>
<xml_diff>
--- a/All document for student management/project order.docx
+++ b/All document for student management/project order.docx
@@ -35,10 +35,7 @@
         <w:t>3. Departments</w:t>
       </w:r>
       <w:r>
-        <w:t xml:space="preserve"> </w:t>
-      </w:r>
-      <w:r>
-        <w:t xml:space="preserve">CRUD         </w:t>
+        <w:t xml:space="preserve"> CRUD         </w:t>
       </w:r>
       <w:r>
         <w:rPr>
@@ -55,10 +52,7 @@
         <w:t>4. Courses</w:t>
       </w:r>
       <w:r>
-        <w:t xml:space="preserve"> </w:t>
-      </w:r>
-      <w:r>
-        <w:t xml:space="preserve">CRUD         </w:t>
+        <w:t xml:space="preserve"> CRUD         </w:t>
       </w:r>
       <w:r>
         <w:rPr>
@@ -73,6 +67,21 @@
     <w:p>
       <w:r>
         <w:t>5. Classes</w:t>
+      </w:r>
+      <w:r>
+        <w:t xml:space="preserve"> </w:t>
+      </w:r>
+      <w:r>
+        <w:t xml:space="preserve">CRUD         </w:t>
+      </w:r>
+      <w:r>
+        <w:rPr>
+          <w:rFonts w:ascii="Segoe UI Emoji" w:hAnsi="Segoe UI Emoji" w:cs="Segoe UI Emoji"/>
+        </w:rPr>
+        <w:t>✅</w:t>
+      </w:r>
+      <w:r>
+        <w:t xml:space="preserve"> Complete</w:t>
       </w:r>
     </w:p>
     <w:p>

</xml_diff>